<commit_message>
Rejoinder and hearing script: itemise all ₹37,358 bills with paper-book pages 79-85
Co-Authored-By: Claude Opus 5.5 <noreply@anthropic.com>
Claude-Session: https://claude.ai/code/session_01NgY68tyia8rJX4vGBVpTKq
</commit_message>
<xml_diff>
--- a/Rejoinder_to_Acko/Court_Hearing_Script_Hindi_Vikas_vs_ACKO.docx
+++ b/Rejoinder_to_Acko/Court_Hearing_Script_Hindi_Vikas_vs_ACKO.docx
@@ -854,7 +854,7 @@
                 <w:sz w:val="22"/>
                 <w:szCs w:val="22"/>
               </w:rPr>
-              <w:t xml:space="preserve">Discharge। ख़र्च ₹37,358। Claim दर्ज।</w:t>
+              <w:t xml:space="preserve">Discharge। कुल ख़र्च ₹37,358 (सारे bills)। Claim दर्ज।</w:t>
             </w:r>
           </w:p>
         </w:tc>
@@ -879,7 +879,7 @@
                 <w:sz w:val="22"/>
                 <w:szCs w:val="22"/>
               </w:rPr>
-              <w:t xml:space="preserve">14</w:t>
+              <w:t xml:space="preserve">14, 79–85</w:t>
             </w:r>
           </w:p>
         </w:tc>
@@ -3541,7 +3541,87 @@
           <w:sz w:val="24"/>
           <w:szCs w:val="24"/>
         </w:rPr>
-        <w:t xml:space="preserve"> Sir, ACKO ने ₹31,846 के bills गिने हैं। बाक़ी ₹5,512 hospital से पहले/बाद की दवाइयों और consultation के bills हैं, जो policy में cover हैं। सारे bills record पर हैं। Claim रकम की वजह से reject नहीं हुआ था।</w:t>
+        <w:t xml:space="preserve"> Sir, मेरे सारे bills paper-book के </w:t>
+      </w:r>
+      <w:r>
+        <w:rPr>
+          <w:rFonts w:ascii="Nirmala UI" w:cs="Nirmala UI" w:eastAsia="Nirmala UI" w:hAnsi="Nirmala UI"/>
+          <w:b/>
+          <w:bCs/>
+          <w:color w:val="1F2937"/>
+          <w:sz w:val="24"/>
+          <w:szCs w:val="24"/>
+        </w:rPr>
+        <w:t xml:space="preserve">पेज 79 से 85</w:t>
+      </w:r>
+      <w:r>
+        <w:rPr>
+          <w:rFonts w:ascii="Nirmala UI" w:cs="Nirmala UI" w:eastAsia="Nirmala UI" w:hAnsi="Nirmala UI"/>
+          <w:color w:val="1F2937"/>
+          <w:sz w:val="24"/>
+          <w:szCs w:val="24"/>
+        </w:rPr>
+        <w:t xml:space="preserve"> पर लगे हैं — कुल </w:t>
+      </w:r>
+      <w:r>
+        <w:rPr>
+          <w:rFonts w:ascii="Nirmala UI" w:cs="Nirmala UI" w:eastAsia="Nirmala UI" w:hAnsi="Nirmala UI"/>
+          <w:b/>
+          <w:bCs/>
+          <w:color w:val="1F2937"/>
+          <w:sz w:val="24"/>
+          <w:szCs w:val="24"/>
+        </w:rPr>
+        <w:t xml:space="preserve">₹37,358</w:t>
+      </w:r>
+      <w:r>
+        <w:rPr>
+          <w:rFonts w:ascii="Nirmala UI" w:cs="Nirmala UI" w:eastAsia="Nirmala UI" w:hAnsi="Nirmala UI"/>
+          <w:color w:val="1F2937"/>
+          <w:sz w:val="24"/>
+          <w:szCs w:val="24"/>
+        </w:rPr>
+        <w:t xml:space="preserve">। ACKO का ₹31,846 सिर्फ़ चार bills का जोड़ है: hospital का final bill ₹25,000, operation से पहले की जाँचें ₹4,050, HOD की जाँचें ₹1,796 और consultation ₹1,000। बाक़ी </w:t>
+      </w:r>
+      <w:r>
+        <w:rPr>
+          <w:rFonts w:ascii="Nirmala UI" w:cs="Nirmala UI" w:eastAsia="Nirmala UI" w:hAnsi="Nirmala UI"/>
+          <w:b/>
+          <w:bCs/>
+          <w:color w:val="1F2937"/>
+          <w:sz w:val="24"/>
+          <w:szCs w:val="24"/>
+        </w:rPr>
+        <w:t xml:space="preserve">₹5,512</w:t>
+      </w:r>
+      <w:r>
+        <w:rPr>
+          <w:rFonts w:ascii="Nirmala UI" w:cs="Nirmala UI" w:eastAsia="Nirmala UI" w:hAnsi="Nirmala UI"/>
+          <w:color w:val="1F2937"/>
+          <w:sz w:val="24"/>
+          <w:szCs w:val="24"/>
+        </w:rPr>
+        <w:t xml:space="preserve"> में उसी operation की </w:t>
+      </w:r>
+      <w:r>
+        <w:rPr>
+          <w:rFonts w:ascii="Nirmala UI" w:cs="Nirmala UI" w:eastAsia="Nirmala UI" w:hAnsi="Nirmala UI"/>
+          <w:b/>
+          <w:bCs/>
+          <w:color w:val="1F2937"/>
+          <w:sz w:val="24"/>
+          <w:szCs w:val="24"/>
+        </w:rPr>
+        <w:t xml:space="preserve">biopsy ₹1,350</w:t>
+      </w:r>
+      <w:r>
+        <w:rPr>
+          <w:rFonts w:ascii="Nirmala UI" w:cs="Nirmala UI" w:eastAsia="Nirmala UI" w:hAnsi="Nirmala UI"/>
+          <w:color w:val="1F2937"/>
+          <w:sz w:val="24"/>
+          <w:szCs w:val="24"/>
+        </w:rPr>
+        <w:t xml:space="preserve">, दवाइयाँ ₹3,162 (₹347 + ₹1,565 + ₹1,250) और operation के बाद की consultation ₹1,000 हैं। ये सब उसी बीमारी और इलाज का ख़र्च है। और Sir, claim रकम की वजह से reject नहीं हुआ था।</w:t>
       </w:r>
     </w:p>
     <w:p>
@@ -4488,7 +4568,7 @@
                 <w:sz w:val="22"/>
                 <w:szCs w:val="22"/>
               </w:rPr>
-              <w:t xml:space="preserve">Sir, ACKO ने ₹31,846 के bills गिने, बाक़ी ₹5,512 पहले/बाद की दवाइयाँ और consultation। सब bills record पर हैं। ACKO ख़ुद ₹31,846 मानता है।</w:t>
+              <w:t xml:space="preserve">Sir, सारे bills पेज 79–85 पर हैं, कुल ₹37,358। ACKO ने सिर्फ़ चार bills (₹25,000 + ₹4,050 + ₹1,796 + ₹1,000) गिने। बाक़ी ₹5,512 = biopsy ₹1,350 + दवाइयाँ ₹3,162 + follow-up ₹1,000। ACKO ख़ुद ₹31,846 मानता है।</w:t>
             </w:r>
           </w:p>
         </w:tc>
@@ -4905,6 +4985,86 @@
                 <w:szCs w:val="22"/>
               </w:rPr>
               <w:t xml:space="preserve">POOR FLOW OF URINE</w:t>
+            </w:r>
+          </w:p>
+        </w:tc>
+      </w:tr>
+      <w:tr>
+        <w:trPr>
+          <w:cantSplit/>
+        </w:trPr>
+        <w:tc>
+          <w:tcPr>
+            <w:tcW w:type="dxa" w:w="4300"/>
+            <w:tcMar>
+              <w:top w:type="dxa" w:w="60"/>
+              <w:left w:type="dxa" w:w="100"/>
+              <w:bottom w:type="dxa" w:w="60"/>
+              <w:right w:type="dxa" w:w="100"/>
+            </w:tcMar>
+          </w:tcPr>
+          <w:p>
+            <w:pPr>
+              <w:spacing w:after="0" w:line="280"/>
+            </w:pPr>
+            <w:r>
+              <w:rPr>
+                <w:rFonts w:ascii="Nirmala UI" w:cs="Nirmala UI" w:eastAsia="Nirmala UI" w:hAnsi="Nirmala UI"/>
+                <w:color w:val="1F2937"/>
+                <w:sz w:val="22"/>
+                <w:szCs w:val="22"/>
+              </w:rPr>
+              <w:t xml:space="preserve">सारे bills — कुल ₹37,358</w:t>
+            </w:r>
+          </w:p>
+        </w:tc>
+        <w:tc>
+          <w:tcPr>
+            <w:tcW w:type="dxa" w:w="1300"/>
+            <w:tcMar>
+              <w:top w:type="dxa" w:w="60"/>
+              <w:left w:type="dxa" w:w="100"/>
+              <w:bottom w:type="dxa" w:w="60"/>
+              <w:right w:type="dxa" w:w="100"/>
+            </w:tcMar>
+          </w:tcPr>
+          <w:p>
+            <w:pPr>
+              <w:spacing w:after="0" w:line="280"/>
+            </w:pPr>
+            <w:r>
+              <w:rPr>
+                <w:rFonts w:ascii="Nirmala UI" w:cs="Nirmala UI" w:eastAsia="Nirmala UI" w:hAnsi="Nirmala UI"/>
+                <w:color w:val="1F2937"/>
+                <w:sz w:val="22"/>
+                <w:szCs w:val="22"/>
+              </w:rPr>
+              <w:t xml:space="preserve">79–85</w:t>
+            </w:r>
+          </w:p>
+        </w:tc>
+        <w:tc>
+          <w:tcPr>
+            <w:tcW w:type="dxa" w:w="4038"/>
+            <w:tcMar>
+              <w:top w:type="dxa" w:w="60"/>
+              <w:left w:type="dxa" w:w="100"/>
+              <w:bottom w:type="dxa" w:w="60"/>
+              <w:right w:type="dxa" w:w="100"/>
+            </w:tcMar>
+          </w:tcPr>
+          <w:p>
+            <w:pPr>
+              <w:spacing w:after="0" w:line="280"/>
+            </w:pPr>
+            <w:r>
+              <w:rPr>
+                <w:rFonts w:ascii="Nirmala UI" w:cs="Nirmala UI" w:eastAsia="Nirmala UI" w:hAnsi="Nirmala UI"/>
+                <w:color w:val="1F2937"/>
+                <w:sz w:val="22"/>
+                <w:szCs w:val="22"/>
+              </w:rPr>
+              <w:t xml:space="preserve">₹25,000 + 4,050 + 1,796 + 1,000 + 1,350 + 347 + 1,565 + 1,250 + 1,000</w:t>
             </w:r>
           </w:p>
         </w:tc>

</xml_diff>

<commit_message>
Rejoinder: object to WS filed 63 days after service (Hilli), add R-1/R-2, instalment reply, HOD bill date; script and README updated
Co-Authored-By: Claude Opus 5.5 <noreply@anthropic.com>
Claude-Session: https://claude.ai/code/session_01NgY68tyia8rJX4vGBVpTKq
</commit_message>
<xml_diff>
--- a/Rejoinder_to_Acko/Court_Hearing_Script_Hindi_Vikas_vs_ACKO.docx
+++ b/Rejoinder_to_Acko/Court_Hearing_Script_Hindi_Vikas_vs_ACKO.docx
@@ -2184,6 +2184,260 @@
           <w:sz w:val="26"/>
           <w:szCs w:val="26"/>
         </w:rPr>
+        <w:t xml:space="preserve">दलील 0 (सबसे पहले) — ACKO का जवाब 63 दिन देर से आया</w:t>
+      </w:r>
+    </w:p>
+    <w:p>
+      <w:pPr>
+        <w:keepNext/>
+        <w:keepLines/>
+        <w:pBdr>
+          <w:left w:val="single" w:color="1E3A8A" w:sz="24" w:space="8"/>
+        </w:pBdr>
+        <w:shd w:fill="EEF2FF" w:color="auto" w:val="clear"/>
+        <w:spacing w:after="40" w:before="60" w:line="320"/>
+        <w:ind w:left="200" w:right="120"/>
+      </w:pPr>
+      <w:r>
+        <w:rPr>
+          <w:rFonts w:ascii="Nirmala UI" w:cs="Nirmala UI" w:eastAsia="Nirmala UI" w:hAnsi="Nirmala UI"/>
+          <w:b/>
+          <w:bCs/>
+          <w:color w:val="1E3A8A"/>
+          <w:sz w:val="24"/>
+          <w:szCs w:val="24"/>
+        </w:rPr>
+        <w:t xml:space="preserve">🗣 बोलें:  </w:t>
+      </w:r>
+      <w:r>
+        <w:rPr>
+          <w:rFonts w:ascii="Nirmala UI" w:cs="Nirmala UI" w:eastAsia="Nirmala UI" w:hAnsi="Nirmala UI"/>
+          <w:color w:val="1F2937"/>
+          <w:sz w:val="24"/>
+          <w:szCs w:val="24"/>
+        </w:rPr>
+        <w:t xml:space="preserve">Sir, सबसे पहले एक कानूनी आपत्ति। ACKO को notice Speed Post से </w:t>
+      </w:r>
+      <w:r>
+        <w:rPr>
+          <w:rFonts w:ascii="Nirmala UI" w:cs="Nirmala UI" w:eastAsia="Nirmala UI" w:hAnsi="Nirmala UI"/>
+          <w:b/>
+          <w:bCs/>
+          <w:color w:val="1F2937"/>
+          <w:sz w:val="24"/>
+          <w:szCs w:val="24"/>
+        </w:rPr>
+        <w:t xml:space="preserve">10.08.2026</w:t>
+      </w:r>
+      <w:r>
+        <w:rPr>
+          <w:rFonts w:ascii="Nirmala UI" w:cs="Nirmala UI" w:eastAsia="Nirmala UI" w:hAnsi="Nirmala UI"/>
+          <w:color w:val="1F2937"/>
+          <w:sz w:val="24"/>
+          <w:szCs w:val="24"/>
+        </w:rPr>
+        <w:t xml:space="preserve"> को मिल गया था। उसका Written Statement </w:t>
+      </w:r>
+      <w:r>
+        <w:rPr>
+          <w:rFonts w:ascii="Nirmala UI" w:cs="Nirmala UI" w:eastAsia="Nirmala UI" w:hAnsi="Nirmala UI"/>
+          <w:b/>
+          <w:bCs/>
+          <w:color w:val="1F2937"/>
+          <w:sz w:val="24"/>
+          <w:szCs w:val="24"/>
+        </w:rPr>
+        <w:t xml:space="preserve">12.10.2026</w:t>
+      </w:r>
+      <w:r>
+        <w:rPr>
+          <w:rFonts w:ascii="Nirmala UI" w:cs="Nirmala UI" w:eastAsia="Nirmala UI" w:hAnsi="Nirmala UI"/>
+          <w:color w:val="1F2937"/>
+          <w:sz w:val="24"/>
+          <w:szCs w:val="24"/>
+        </w:rPr>
+        <w:t xml:space="preserve"> को आया, यानी </w:t>
+      </w:r>
+      <w:r>
+        <w:rPr>
+          <w:rFonts w:ascii="Nirmala UI" w:cs="Nirmala UI" w:eastAsia="Nirmala UI" w:hAnsi="Nirmala UI"/>
+          <w:b/>
+          <w:bCs/>
+          <w:color w:val="1F2937"/>
+          <w:sz w:val="24"/>
+          <w:szCs w:val="24"/>
+        </w:rPr>
+        <w:t xml:space="preserve">63 दिन बाद।</w:t>
+      </w:r>
+    </w:p>
+    <w:p>
+      <w:pPr>
+        <w:keepNext/>
+        <w:keepLines/>
+        <w:pBdr>
+          <w:left w:val="single" w:color="1E3A8A" w:sz="24" w:space="8"/>
+        </w:pBdr>
+        <w:shd w:fill="EEF2FF" w:color="auto" w:val="clear"/>
+        <w:spacing w:after="40" w:before="0" w:line="320"/>
+        <w:ind w:left="200" w:right="120"/>
+      </w:pPr>
+      <w:r>
+        <w:rPr>
+          <w:rFonts w:ascii="Nirmala UI" w:cs="Nirmala UI" w:eastAsia="Nirmala UI" w:hAnsi="Nirmala UI"/>
+          <w:color w:val="1F2937"/>
+          <w:sz w:val="24"/>
+          <w:szCs w:val="24"/>
+        </w:rPr>
+        <w:t xml:space="preserve">Consumer Protection Act की धारा 38(3)(a) में जवाब के लिए 30 दिन, और ज़्यादा से ज़्यादा 15 दिन और, यानी कुल </w:t>
+      </w:r>
+      <w:r>
+        <w:rPr>
+          <w:rFonts w:ascii="Nirmala UI" w:cs="Nirmala UI" w:eastAsia="Nirmala UI" w:hAnsi="Nirmala UI"/>
+          <w:b/>
+          <w:bCs/>
+          <w:color w:val="1F2937"/>
+          <w:sz w:val="24"/>
+          <w:szCs w:val="24"/>
+        </w:rPr>
+        <w:t xml:space="preserve">45 दिन</w:t>
+      </w:r>
+      <w:r>
+        <w:rPr>
+          <w:rFonts w:ascii="Nirmala UI" w:cs="Nirmala UI" w:eastAsia="Nirmala UI" w:hAnsi="Nirmala UI"/>
+          <w:color w:val="1F2937"/>
+          <w:sz w:val="24"/>
+          <w:szCs w:val="24"/>
+        </w:rPr>
+        <w:t xml:space="preserve"> मिलते हैं। Supreme Court की Constitution Bench ने </w:t>
+      </w:r>
+      <w:r>
+        <w:rPr>
+          <w:rFonts w:ascii="Nirmala UI" w:cs="Nirmala UI" w:eastAsia="Nirmala UI" w:hAnsi="Nirmala UI"/>
+          <w:b/>
+          <w:bCs/>
+          <w:color w:val="1F2937"/>
+          <w:sz w:val="24"/>
+          <w:szCs w:val="24"/>
+        </w:rPr>
+        <w:t xml:space="preserve">New India Assurance बनाम Hilli Multipurpose Cold Storage, (2020) 5 SCC 757</w:t>
+      </w:r>
+      <w:r>
+        <w:rPr>
+          <w:rFonts w:ascii="Nirmala UI" w:cs="Nirmala UI" w:eastAsia="Nirmala UI" w:hAnsi="Nirmala UI"/>
+          <w:color w:val="1F2937"/>
+          <w:sz w:val="24"/>
+          <w:szCs w:val="24"/>
+        </w:rPr>
+        <w:t xml:space="preserve"> में कहा है कि 45 दिन के बाद आयोग समय नहीं बढ़ा सकता।</w:t>
+      </w:r>
+    </w:p>
+    <w:p>
+      <w:pPr>
+        <w:keepNext w:val="false"/>
+        <w:keepLines/>
+        <w:pBdr>
+          <w:left w:val="single" w:color="1E3A8A" w:sz="24" w:space="8"/>
+        </w:pBdr>
+        <w:shd w:fill="EEF2FF" w:color="auto" w:val="clear"/>
+        <w:spacing w:after="160" w:before="0" w:line="320"/>
+        <w:ind w:left="200" w:right="120"/>
+      </w:pPr>
+      <w:r>
+        <w:rPr>
+          <w:rFonts w:ascii="Nirmala UI" w:cs="Nirmala UI" w:eastAsia="Nirmala UI" w:hAnsi="Nirmala UI"/>
+          <w:color w:val="1F2937"/>
+          <w:sz w:val="24"/>
+          <w:szCs w:val="24"/>
+        </w:rPr>
+        <w:t xml:space="preserve">इसलिए Sir, ACKO का WS record पर नहीं लिया जाना चाहिए, और मामला मेरे सबूतों के आधार पर तय हो। फिर भी, सावधानी के लिए मैं उसके हर बिंदु का जवाब भी देता हूँ।</w:t>
+      </w:r>
+    </w:p>
+    <w:p>
+      <w:pPr>
+        <w:keepNext w:val="false"/>
+        <w:keepLines/>
+        <w:pBdr>
+          <w:left w:val="single" w:color="CA8A04" w:sz="24" w:space="8"/>
+        </w:pBdr>
+        <w:shd w:fill="FEF9C3" w:color="auto" w:val="clear"/>
+        <w:spacing w:after="160" w:before="60" w:line="320"/>
+        <w:ind w:left="200" w:right="120"/>
+      </w:pPr>
+      <w:r>
+        <w:rPr>
+          <w:rFonts w:ascii="Nirmala UI" w:cs="Nirmala UI" w:eastAsia="Nirmala UI" w:hAnsi="Nirmala UI"/>
+          <w:b/>
+          <w:bCs/>
+          <w:color w:val="CA8A04"/>
+          <w:sz w:val="24"/>
+          <w:szCs w:val="24"/>
+        </w:rPr>
+        <w:t xml:space="preserve">📄 दिखाएँ:  </w:t>
+      </w:r>
+      <w:r>
+        <w:rPr>
+          <w:rFonts w:ascii="Nirmala UI" w:cs="Nirmala UI" w:eastAsia="Nirmala UI" w:hAnsi="Nirmala UI"/>
+          <w:color w:val="1F2937"/>
+          <w:sz w:val="24"/>
+          <w:szCs w:val="24"/>
+        </w:rPr>
+        <w:t xml:space="preserve">Rejoinder के साथ लगी </w:t>
+      </w:r>
+      <w:r>
+        <w:rPr>
+          <w:rFonts w:ascii="Nirmala UI" w:cs="Nirmala UI" w:eastAsia="Nirmala UI" w:hAnsi="Nirmala UI"/>
+          <w:b/>
+          <w:bCs/>
+          <w:color w:val="1F2937"/>
+          <w:sz w:val="24"/>
+          <w:szCs w:val="24"/>
+        </w:rPr>
+        <w:t xml:space="preserve">Annexure R-1</w:t>
+      </w:r>
+      <w:r>
+        <w:rPr>
+          <w:rFonts w:ascii="Nirmala UI" w:cs="Nirmala UI" w:eastAsia="Nirmala UI" w:hAnsi="Nirmala UI"/>
+          <w:color w:val="1F2937"/>
+          <w:sz w:val="24"/>
+          <w:szCs w:val="24"/>
+        </w:rPr>
+        <w:t xml:space="preserve"> — India Post tracking (Article EU031901035IN): Booked 05.08.2026, </w:t>
+      </w:r>
+      <w:r>
+        <w:rPr>
+          <w:rFonts w:ascii="Nirmala UI" w:cs="Nirmala UI" w:eastAsia="Nirmala UI" w:hAnsi="Nirmala UI"/>
+          <w:b/>
+          <w:bCs/>
+          <w:color w:val="1F2937"/>
+          <w:sz w:val="24"/>
+          <w:szCs w:val="24"/>
+        </w:rPr>
+        <w:t xml:space="preserve">Delivered 10.08.2026</w:t>
+      </w:r>
+      <w:r>
+        <w:rPr>
+          <w:rFonts w:ascii="Nirmala UI" w:cs="Nirmala UI" w:eastAsia="Nirmala UI" w:hAnsi="Nirmala UI"/>
+          <w:color w:val="1F2937"/>
+          <w:sz w:val="24"/>
+          <w:szCs w:val="24"/>
+        </w:rPr>
+        <w:t xml:space="preserve">।</w:t>
+      </w:r>
+    </w:p>
+    <w:p>
+      <w:pPr>
+        <w:keepNext/>
+        <w:spacing w:after="100" w:before="220"/>
+      </w:pPr>
+      <w:r>
+        <w:rPr>
+          <w:rFonts w:ascii="Nirmala UI" w:cs="Nirmala UI" w:eastAsia="Nirmala UI" w:hAnsi="Nirmala UI"/>
+          <w:b/>
+          <w:bCs/>
+          <w:color w:val="1F2937"/>
+          <w:sz w:val="26"/>
+          <w:szCs w:val="26"/>
+        </w:rPr>
         <w:t xml:space="preserve">दलील 1 — Surgery ज़रूरी थी, cosmetic नहीं</w:t>
       </w:r>
     </w:p>
@@ -4144,6 +4398,61 @@
                 <w:szCs w:val="22"/>
               </w:rPr>
               <w:t xml:space="preserve">आपका जवाब</w:t>
+            </w:r>
+          </w:p>
+        </w:tc>
+      </w:tr>
+      <w:tr>
+        <w:trPr>
+          <w:cantSplit/>
+        </w:trPr>
+        <w:tc>
+          <w:tcPr>
+            <w:tcW w:type="dxa" w:w="3900"/>
+            <w:tcMar>
+              <w:top w:type="dxa" w:w="60"/>
+              <w:left w:type="dxa" w:w="100"/>
+              <w:bottom w:type="dxa" w:w="60"/>
+              <w:right w:type="dxa" w:w="100"/>
+            </w:tcMar>
+          </w:tcPr>
+          <w:p>
+            <w:pPr>
+              <w:spacing w:after="0" w:line="280"/>
+            </w:pPr>
+            <w:r>
+              <w:rPr>
+                <w:rFonts w:ascii="Nirmala UI" w:cs="Nirmala UI" w:eastAsia="Nirmala UI" w:hAnsi="Nirmala UI"/>
+                <w:color w:val="1F2937"/>
+                <w:sz w:val="22"/>
+                <w:szCs w:val="22"/>
+              </w:rPr>
+              <w:t xml:space="preserve">"आपकी 45 दिन वाली आपत्ति का आधार?"</w:t>
+            </w:r>
+          </w:p>
+        </w:tc>
+        <w:tc>
+          <w:tcPr>
+            <w:tcW w:type="dxa" w:w="5738"/>
+            <w:tcMar>
+              <w:top w:type="dxa" w:w="60"/>
+              <w:left w:type="dxa" w:w="100"/>
+              <w:bottom w:type="dxa" w:w="60"/>
+              <w:right w:type="dxa" w:w="100"/>
+            </w:tcMar>
+          </w:tcPr>
+          <w:p>
+            <w:pPr>
+              <w:spacing w:after="0" w:line="280"/>
+            </w:pPr>
+            <w:r>
+              <w:rPr>
+                <w:rFonts w:ascii="Nirmala UI" w:cs="Nirmala UI" w:eastAsia="Nirmala UI" w:hAnsi="Nirmala UI"/>
+                <w:color w:val="1F2937"/>
+                <w:sz w:val="22"/>
+                <w:szCs w:val="22"/>
+              </w:rPr>
+              <w:t xml:space="preserve">Sir, notice 10.08.2026 को delivered (Annexure R-1, India Post tracking), WS 12.10.2026 को file हुआ, यानी 63 दिन। धारा 38(3)(a) और Hilli Multipurpose (2020) 5 SCC 757 के अनुसार 45 दिन के बाद WS नहीं लिया जा सकता।</w:t>
             </w:r>
           </w:p>
         </w:tc>
@@ -5010,6 +5319,97 @@
             <w:r>
               <w:rPr>
                 <w:rFonts w:ascii="Nirmala UI" w:cs="Nirmala UI" w:eastAsia="Nirmala UI" w:hAnsi="Nirmala UI"/>
+                <w:b/>
+                <w:bCs/>
+                <w:color w:val="1F2937"/>
+                <w:sz w:val="22"/>
+                <w:szCs w:val="22"/>
+              </w:rPr>
+              <w:t xml:space="preserve">WS 63 दिन देर से</w:t>
+            </w:r>
+            <w:r>
+              <w:rPr>
+                <w:rFonts w:ascii="Nirmala UI" w:cs="Nirmala UI" w:eastAsia="Nirmala UI" w:hAnsi="Nirmala UI"/>
+                <w:color w:val="1F2937"/>
+                <w:sz w:val="22"/>
+                <w:szCs w:val="22"/>
+              </w:rPr>
+              <w:t xml:space="preserve"> (notice 10.08 → WS 12.10.2026)</w:t>
+            </w:r>
+          </w:p>
+        </w:tc>
+        <w:tc>
+          <w:tcPr>
+            <w:tcW w:type="dxa" w:w="1300"/>
+            <w:tcMar>
+              <w:top w:type="dxa" w:w="60"/>
+              <w:left w:type="dxa" w:w="100"/>
+              <w:bottom w:type="dxa" w:w="60"/>
+              <w:right w:type="dxa" w:w="100"/>
+            </w:tcMar>
+          </w:tcPr>
+          <w:p>
+            <w:pPr>
+              <w:spacing w:after="0" w:line="280"/>
+            </w:pPr>
+            <w:r>
+              <w:rPr>
+                <w:rFonts w:ascii="Nirmala UI" w:cs="Nirmala UI" w:eastAsia="Nirmala UI" w:hAnsi="Nirmala UI"/>
+                <w:color w:val="1F2937"/>
+                <w:sz w:val="22"/>
+                <w:szCs w:val="22"/>
+              </w:rPr>
+              <w:t xml:space="preserve">R-1</w:t>
+            </w:r>
+          </w:p>
+        </w:tc>
+        <w:tc>
+          <w:tcPr>
+            <w:tcW w:type="dxa" w:w="4038"/>
+            <w:tcMar>
+              <w:top w:type="dxa" w:w="60"/>
+              <w:left w:type="dxa" w:w="100"/>
+              <w:bottom w:type="dxa" w:w="60"/>
+              <w:right w:type="dxa" w:w="100"/>
+            </w:tcMar>
+          </w:tcPr>
+          <w:p>
+            <w:pPr>
+              <w:spacing w:after="0" w:line="280"/>
+            </w:pPr>
+            <w:r>
+              <w:rPr>
+                <w:rFonts w:ascii="Nirmala UI" w:cs="Nirmala UI" w:eastAsia="Nirmala UI" w:hAnsi="Nirmala UI"/>
+                <w:color w:val="1F2937"/>
+                <w:sz w:val="22"/>
+                <w:szCs w:val="22"/>
+              </w:rPr>
+              <w:t xml:space="preserve">Hilli Multipurpose, (2020) 5 SCC 757 — 45 दिन</w:t>
+            </w:r>
+          </w:p>
+        </w:tc>
+      </w:tr>
+      <w:tr>
+        <w:trPr>
+          <w:cantSplit/>
+        </w:trPr>
+        <w:tc>
+          <w:tcPr>
+            <w:tcW w:type="dxa" w:w="4300"/>
+            <w:tcMar>
+              <w:top w:type="dxa" w:w="60"/>
+              <w:left w:type="dxa" w:w="100"/>
+              <w:bottom w:type="dxa" w:w="60"/>
+              <w:right w:type="dxa" w:w="100"/>
+            </w:tcMar>
+          </w:tcPr>
+          <w:p>
+            <w:pPr>
+              <w:spacing w:after="0" w:line="280"/>
+            </w:pPr>
+            <w:r>
+              <w:rPr>
+                <w:rFonts w:ascii="Nirmala UI" w:cs="Nirmala UI" w:eastAsia="Nirmala UI" w:hAnsi="Nirmala UI"/>
                 <w:color w:val="1F2937"/>
                 <w:sz w:val="22"/>
                 <w:szCs w:val="22"/>
@@ -5971,7 +6371,27 @@
           <w:sz w:val="24"/>
           <w:szCs w:val="24"/>
         </w:rPr>
-        <w:t xml:space="preserve">सबसे ज़रूरी 3 बातें: </w:t>
+        <w:t xml:space="preserve">सबसे ज़रूरी बातें: </w:t>
+      </w:r>
+      <w:r>
+        <w:rPr>
+          <w:rFonts w:ascii="Nirmala UI" w:cs="Nirmala UI" w:eastAsia="Nirmala UI" w:hAnsi="Nirmala UI"/>
+          <w:b/>
+          <w:bCs/>
+          <w:color w:val="1F2937"/>
+          <w:sz w:val="24"/>
+          <w:szCs w:val="24"/>
+        </w:rPr>
+        <w:t xml:space="preserve">(0)</w:t>
+      </w:r>
+      <w:r>
+        <w:rPr>
+          <w:rFonts w:ascii="Nirmala UI" w:cs="Nirmala UI" w:eastAsia="Nirmala UI" w:hAnsi="Nirmala UI"/>
+          <w:color w:val="1F2937"/>
+          <w:sz w:val="24"/>
+          <w:szCs w:val="24"/>
+        </w:rPr>
+        <w:t xml:space="preserve"> WS 63 दिन देर से आया, </w:t>
       </w:r>
       <w:r>
         <w:rPr>
@@ -6050,7 +6470,7 @@
           <w:sz w:val="24"/>
           <w:szCs w:val="24"/>
         </w:rPr>
-        <w:t xml:space="preserve">साथ ले जाएँ: AckoCase.pdf का प्रिंट, ACKO का WS, Rejoinder की copy, यह स्क्रिप्ट, Aadhaar, पेन।</w:t>
+        <w:t xml:space="preserve">साथ ले जाएँ: AckoCase.pdf का प्रिंट, ACKO का WS, Rejoinder की copy (Annexure R-1, R-2 सहित), डॉक्टर के certificate का original, यह स्क्रिप्ट, Aadhaar, पेन।</w:t>
       </w:r>
     </w:p>
     <w:sectPr>

</xml_diff>

<commit_message>
Hearing script: notice and complaint copy sent together in one Speed Post envelope
Co-Authored-By: Claude Opus 5.5 <noreply@anthropic.com>
Claude-Session: https://claude.ai/code/session_01NgY68tyia8rJX4vGBVpTKq
</commit_message>
<xml_diff>
--- a/Rejoinder_to_Acko/Court_Hearing_Script_Hindi_Vikas_vs_ACKO.docx
+++ b/Rejoinder_to_Acko/Court_Hearing_Script_Hindi_Vikas_vs_ACKO.docx
@@ -2216,7 +2216,27 @@
           <w:sz w:val="24"/>
           <w:szCs w:val="24"/>
         </w:rPr>
-        <w:t xml:space="preserve">Sir, सबसे पहले एक कानूनी आपत्ति। ACKO को notice Speed Post से </w:t>
+        <w:t xml:space="preserve">Sir, सबसे पहले एक कानूनी आपत्ति। आयोग का दिया notice और complaint की पूरी copy (paper-book पेज 10–25), दोनों मैंने </w:t>
+      </w:r>
+      <w:r>
+        <w:rPr>
+          <w:rFonts w:ascii="Nirmala UI" w:cs="Nirmala UI" w:eastAsia="Nirmala UI" w:hAnsi="Nirmala UI"/>
+          <w:b/>
+          <w:bCs/>
+          <w:color w:val="1F2937"/>
+          <w:sz w:val="24"/>
+          <w:szCs w:val="24"/>
+        </w:rPr>
+        <w:t xml:space="preserve">एक ही लिफ़ाफ़े में</w:t>
+      </w:r>
+      <w:r>
+        <w:rPr>
+          <w:rFonts w:ascii="Nirmala UI" w:cs="Nirmala UI" w:eastAsia="Nirmala UI" w:hAnsi="Nirmala UI"/>
+          <w:color w:val="1F2937"/>
+          <w:sz w:val="24"/>
+          <w:szCs w:val="24"/>
+        </w:rPr>
+        <w:t xml:space="preserve"> Speed Post से भेजे थे। ACKO को यह लिफ़ाफ़ा </w:t>
       </w:r>
       <w:r>
         <w:rPr>
@@ -4398,6 +4418,61 @@
                 <w:szCs w:val="22"/>
               </w:rPr>
               <w:t xml:space="preserve">आपका जवाब</w:t>
+            </w:r>
+          </w:p>
+        </w:tc>
+      </w:tr>
+      <w:tr>
+        <w:trPr>
+          <w:cantSplit/>
+        </w:trPr>
+        <w:tc>
+          <w:tcPr>
+            <w:tcW w:type="dxa" w:w="3900"/>
+            <w:tcMar>
+              <w:top w:type="dxa" w:w="60"/>
+              <w:left w:type="dxa" w:w="100"/>
+              <w:bottom w:type="dxa" w:w="60"/>
+              <w:right w:type="dxa" w:w="100"/>
+            </w:tcMar>
+          </w:tcPr>
+          <w:p>
+            <w:pPr>
+              <w:spacing w:after="0" w:line="280"/>
+            </w:pPr>
+            <w:r>
+              <w:rPr>
+                <w:rFonts w:ascii="Nirmala UI" w:cs="Nirmala UI" w:eastAsia="Nirmala UI" w:hAnsi="Nirmala UI"/>
+                <w:color w:val="1F2937"/>
+                <w:sz w:val="22"/>
+                <w:szCs w:val="22"/>
+              </w:rPr>
+              <w:t xml:space="preserve">"क्या notice के साथ complaint की copy भी भेजी थी?"</w:t>
+            </w:r>
+          </w:p>
+        </w:tc>
+        <w:tc>
+          <w:tcPr>
+            <w:tcW w:type="dxa" w:w="5738"/>
+            <w:tcMar>
+              <w:top w:type="dxa" w:w="60"/>
+              <w:left w:type="dxa" w:w="100"/>
+              <w:bottom w:type="dxa" w:w="60"/>
+              <w:right w:type="dxa" w:w="100"/>
+            </w:tcMar>
+          </w:tcPr>
+          <w:p>
+            <w:pPr>
+              <w:spacing w:after="0" w:line="280"/>
+            </w:pPr>
+            <w:r>
+              <w:rPr>
+                <w:rFonts w:ascii="Nirmala UI" w:cs="Nirmala UI" w:eastAsia="Nirmala UI" w:hAnsi="Nirmala UI"/>
+                <w:color w:val="1F2937"/>
+                <w:sz w:val="22"/>
+                <w:szCs w:val="22"/>
+              </w:rPr>
+              <w:t xml:space="preserve">जी Sir। आयोग का दिया notice और complaint की पूरी copy (पेज 10–25), दोनों मैंने ख़ुद एक ही लिफ़ाफ़े में डालकर Speed Post (EU031901035IN) से भेजे थे। Original रसीद मेरे पास है।</w:t>
             </w:r>
           </w:p>
         </w:tc>
@@ -6470,7 +6545,7 @@
           <w:sz w:val="24"/>
           <w:szCs w:val="24"/>
         </w:rPr>
-        <w:t xml:space="preserve">साथ ले जाएँ: AckoCase.pdf का प्रिंट, ACKO का WS, Rejoinder की copy (Annexure R-1, R-2 सहित), डॉक्टर के certificate का original, यह स्क्रिप्ट, Aadhaar, पेन।</w:t>
+        <w:t xml:space="preserve">साथ ले जाएँ: AckoCase.pdf का प्रिंट, ACKO का WS, Rejoinder की copy (Annexure R-1, R-2 सहित), Speed Post की original रसीद, डॉक्टर के certificate का original, यह स्क्रिप्ट, Aadhaar, पेन।</w:t>
       </w:r>
     </w:p>
     <w:sectPr>

</xml_diff>